<commit_message>
fix: carta com local em branco e município em linha própria
O local da data deixa de vir fixado em Limoeiro do Norte (o documento
vai também a Russas e Morada Nova), e serventia e município ficam em
linhas separadas, alinhadas.
</commit_message>
<xml_diff>
--- a/data/validacao/documento_cartorio_registro_civil.docx
+++ b/data/validacao/documento_cartorio_registro_civil.docx
@@ -8,12 +8,12 @@
         <w:jc w:val="right"/>
       </w:pPr>
       <w:r>
-        <w:t>Limoeiro do Norte (CE), ____ de ______________ de 2026.</w:t>
+        <w:t>______________________ (CE), ____ de ______________ de 2026.</w:t>
       </w:r>
     </w:p>
     <w:p>
       <w:pPr>
-        <w:spacing w:after="40"/>
+        <w:spacing w:after="120"/>
       </w:pPr>
       <w:r>
         <w:rPr>
@@ -25,10 +25,18 @@
     </w:p>
     <w:p>
       <w:pPr>
+        <w:spacing w:after="120"/>
+      </w:pPr>
+      <w:r>
+        <w:t>Serventia:  ____________________________________________________________</w:t>
+      </w:r>
+    </w:p>
+    <w:p>
+      <w:pPr>
         <w:spacing w:after="360"/>
       </w:pPr>
       <w:r>
-        <w:t>Serventia: ________________________________   Município: __________________</w:t>
+        <w:t>Município:  ____________________________________________________________</w:t>
       </w:r>
     </w:p>
     <w:p>
@@ -11232,10 +11240,10 @@
 <file path=word/numbering.xml><?xml version="1.0" encoding="utf-8"?>
 <w:numbering xmlns:wpc="http://schemas.microsoft.com/office/word/2010/wordprocessingCanvas" xmlns:cx="http://schemas.microsoft.com/office/drawing/2014/chartex" xmlns:cx1="http://schemas.microsoft.com/office/drawing/2015/9/8/chartex" xmlns:cx2="http://schemas.microsoft.com/office/drawing/2015/10/21/chartex" xmlns:cx3="http://schemas.microsoft.com/office/drawing/2016/5/9/chartex" xmlns:cx4="http://schemas.microsoft.com/office/drawing/2016/5/10/chartex" xmlns:cx5="http://schemas.microsoft.com/office/drawing/2016/5/11/chartex" xmlns:cx6="http://schemas.microsoft.com/office/drawing/2016/5/12/chartex" xmlns:cx7="http://schemas.microsoft.com/office/drawing/2016/5/13/chartex" xmlns:cx8="http://schemas.microsoft.com/office/drawing/2016/5/14/chartex" xmlns:mc="http://schemas.openxmlformats.org/markup-compatibility/2006" xmlns:aink="http://schemas.microsoft.com/office/drawing/2016/ink" xmlns:am3d="http://schemas.microsoft.com/office/drawing/2017/model3d" xmlns:o="urn:schemas-microsoft-com:office:office" xmlns:oel="http://schemas.microsoft.com/office/2019/extlst" xmlns:r="http://schemas.openxmlformats.org/officeDocument/2006/relationships" xmlns:m="http://schemas.openxmlformats.org/officeDocument/2006/math" xmlns:v="urn:schemas-microsoft-com:vml" xmlns:wp14="http://schemas.microsoft.com/office/word/2010/wordprocessingDrawing" xmlns:wp="http://schemas.openxmlformats.org/drawingml/2006/wordprocessingDrawing" xmlns:w10="urn:schemas-microsoft-com:office:word" xmlns:w="http://schemas.openxmlformats.org/wordprocessingml/2006/main" xmlns:w14="http://schemas.microsoft.com/office/word/2010/wordml" xmlns:w15="http://schemas.microsoft.com/office/word/2012/wordml" xmlns:w16cex="http://schemas.microsoft.com/office/word/2018/wordml/cex" xmlns:w16cid="http://schemas.microsoft.com/office/word/2016/wordml/cid" xmlns:w16="http://schemas.microsoft.com/office/word/2018/wordml" xmlns:w16du="http://schemas.microsoft.com/office/word/2023/wordml/word16du" xmlns:w16sdtdh="http://schemas.microsoft.com/office/word/2020/wordml/sdtdatahash" xmlns:w16sdtfl="http://schemas.microsoft.com/office/word/2024/wordml/sdtformatlock" xmlns:w16se="http://schemas.microsoft.com/office/word/2015/wordml/symex" xmlns:wpg="http://schemas.microsoft.com/office/word/2010/wordprocessingGroup" xmlns:wpi="http://schemas.microsoft.com/office/word/2010/wordprocessingInk" xmlns:wne="http://schemas.microsoft.com/office/word/2006/wordml" xmlns:wps="http://schemas.microsoft.com/office/word/2010/wordprocessingShape" mc:Ignorable="w14 w15 w16se w16cid w16 w16cex w16sdtdh w16sdtfl w16du wp14">
   <w:abstractNum w:abstractNumId="0" w15:restartNumberingAfterBreak="0">
-    <w:nsid w:val="125F03CC"/>
+    <w:nsid w:val="36145993"/>
     <w:multiLevelType w:val="hybridMultilevel"/>
-    <w:tmpl w:val="C0A02F70"/>
-    <w:lvl w:ilvl="0" w:tplc="2D929368">
+    <w:tmpl w:val="EFBEF058"/>
+    <w:lvl w:ilvl="0" w:tplc="E0DC1B16">
       <w:start w:val="1"/>
       <w:numFmt w:val="bullet"/>
       <w:lvlText w:val="●"/>
@@ -11244,7 +11252,7 @@
         <w:ind w:left="720" w:hanging="360"/>
       </w:pPr>
     </w:lvl>
-    <w:lvl w:ilvl="1" w:tplc="970081B2">
+    <w:lvl w:ilvl="1" w:tplc="6340081C">
       <w:start w:val="1"/>
       <w:numFmt w:val="bullet"/>
       <w:lvlText w:val="○"/>
@@ -11253,7 +11261,7 @@
         <w:ind w:left="1440" w:hanging="360"/>
       </w:pPr>
     </w:lvl>
-    <w:lvl w:ilvl="2" w:tplc="256A9F38">
+    <w:lvl w:ilvl="2" w:tplc="8040B500">
       <w:start w:val="1"/>
       <w:numFmt w:val="bullet"/>
       <w:lvlText w:val="■"/>
@@ -11262,7 +11270,7 @@
         <w:ind w:left="2160" w:hanging="360"/>
       </w:pPr>
     </w:lvl>
-    <w:lvl w:ilvl="3" w:tplc="9CDC19F2">
+    <w:lvl w:ilvl="3" w:tplc="65E09C3A">
       <w:start w:val="1"/>
       <w:numFmt w:val="bullet"/>
       <w:lvlText w:val="●"/>
@@ -11271,7 +11279,7 @@
         <w:ind w:left="2880" w:hanging="360"/>
       </w:pPr>
     </w:lvl>
-    <w:lvl w:ilvl="4" w:tplc="C090CFCE">
+    <w:lvl w:ilvl="4" w:tplc="ED00B3CA">
       <w:start w:val="1"/>
       <w:numFmt w:val="bullet"/>
       <w:lvlText w:val="○"/>
@@ -11280,7 +11288,7 @@
         <w:ind w:left="3600" w:hanging="360"/>
       </w:pPr>
     </w:lvl>
-    <w:lvl w:ilvl="5" w:tplc="8E18B116">
+    <w:lvl w:ilvl="5" w:tplc="C3F88E78">
       <w:start w:val="1"/>
       <w:numFmt w:val="bullet"/>
       <w:lvlText w:val="■"/>
@@ -11289,7 +11297,7 @@
         <w:ind w:left="4320" w:hanging="360"/>
       </w:pPr>
     </w:lvl>
-    <w:lvl w:ilvl="6" w:tplc="3572E448">
+    <w:lvl w:ilvl="6" w:tplc="096E03C2">
       <w:start w:val="1"/>
       <w:numFmt w:val="bullet"/>
       <w:lvlText w:val="●"/>
@@ -11298,7 +11306,7 @@
         <w:ind w:left="5040" w:hanging="360"/>
       </w:pPr>
     </w:lvl>
-    <w:lvl w:ilvl="7" w:tplc="20E2F22A">
+    <w:lvl w:ilvl="7" w:tplc="639E0CB8">
       <w:start w:val="1"/>
       <w:numFmt w:val="bullet"/>
       <w:lvlText w:val="●"/>
@@ -11307,7 +11315,7 @@
         <w:ind w:left="5760" w:hanging="360"/>
       </w:pPr>
     </w:lvl>
-    <w:lvl w:ilvl="8" w:tplc="BA840050">
+    <w:lvl w:ilvl="8" w:tplc="2FF643C6">
       <w:start w:val="1"/>
       <w:numFmt w:val="bullet"/>
       <w:lvlText w:val="●"/>
@@ -11317,7 +11325,7 @@
       </w:pPr>
     </w:lvl>
   </w:abstractNum>
-  <w:num w:numId="1" w16cid:durableId="807818206">
+  <w:num w:numId="1" w16cid:durableId="728112310">
     <w:abstractNumId w:val="0"/>
     <w:lvlOverride w:ilvl="0">
       <w:startOverride w:val="1"/>

</xml_diff>

<commit_message>
feat: papel timbrado com a identificação do proponente no documento do cartório
- cabeçalho com monograma, nome, qualificações (residente em IA aplicada
  a ambientes corporativos pela SiDi/Softex; desenvolvedor de sistemas e
  aplicações web) e contatos; assinatura no mesmo padrão e nome no rodapé
- "Cartório (nome da serventia)" no lugar de "Serventia", com dica no
  campo do PDF preenchível
- mesma identificação no PDF preenchível e na versão para imprimir; a
  carta continua em uma página
</commit_message>
<xml_diff>
--- a/data/validacao/documento_cartorio_registro_civil.docx
+++ b/data/validacao/documento_cartorio_registro_civil.docx
@@ -4,7 +4,63 @@
   <w:body>
     <w:p>
       <w:pPr>
-        <w:spacing w:after="360"/>
+        <w:spacing w:after="20"/>
+      </w:pPr>
+      <w:r>
+        <w:rPr>
+          <w:b/>
+          <w:bCs/>
+          <w:color w:val="1F2328"/>
+          <w:sz w:val="32"/>
+          <w:szCs w:val="32"/>
+        </w:rPr>
+        <w:t>Idarlan Magalhães</w:t>
+      </w:r>
+    </w:p>
+    <w:p>
+      <w:r>
+        <w:rPr>
+          <w:color w:val="1F4E79"/>
+          <w:sz w:val="19"/>
+          <w:szCs w:val="19"/>
+        </w:rPr>
+        <w:t>Residente em Inteligência Artificial Aplicada a Ambientes Corporativos · SiDi/Softex</w:t>
+      </w:r>
+    </w:p>
+    <w:p>
+      <w:r>
+        <w:rPr>
+          <w:color w:val="1F4E79"/>
+          <w:sz w:val="19"/>
+          <w:szCs w:val="19"/>
+        </w:rPr>
+        <w:t>Desenvolvedor de sistemas e aplicações web</w:t>
+      </w:r>
+    </w:p>
+    <w:p>
+      <w:pPr>
+        <w:pBdr>
+          <w:bottom w:val="single" w:sz="10" w:space="4" w:color="1F4E79"/>
+        </w:pBdr>
+        <w:spacing w:before="80" w:after="40"/>
+      </w:pPr>
+    </w:p>
+    <w:p>
+      <w:pPr>
+        <w:spacing w:after="320"/>
+      </w:pPr>
+      <w:r>
+        <w:rPr>
+          <w:color w:val="595959"/>
+          <w:sz w:val="17"/>
+          <w:szCs w:val="17"/>
+        </w:rPr>
+        <w:t>idarlandias@gmail.com   ·   github.com/idarlandias   ·   linkedin.com/in/idarlandias</w:t>
+      </w:r>
+    </w:p>
+    <w:p>
+      <w:pPr>
+        <w:spacing w:after="280"/>
         <w:jc w:val="right"/>
       </w:pPr>
       <w:r>
@@ -28,12 +84,12 @@
         <w:spacing w:after="120"/>
       </w:pPr>
       <w:r>
-        <w:t>Serventia:  ____________________________________________________________</w:t>
+        <w:t>Cartório (nome da serventia):  ______________________________________________</w:t>
       </w:r>
     </w:p>
     <w:p>
       <w:pPr>
-        <w:spacing w:after="360"/>
+        <w:spacing w:after="280"/>
       </w:pPr>
       <w:r>
         <w:t>Município:  ____________________________________________________________</w:t>
@@ -64,7 +120,7 @@
         <w:spacing w:after="120"/>
       </w:pPr>
       <w:r>
-        <w:t>Meu nome é Idarlan Magalhães e participo da Residência em Inteligência Artificial da SiDi/Softex. Estudo como funciona, na prática, o atendimento de pedidos de certidão no Registro Civil quando o pedido envolve dados pessoais: quem pode pedir, o que exigir do requerente e quando a expedição depende de autorização judicial.</w:t>
+        <w:t>Meu nome é Idarlan Magalhães. Sou residente em Inteligência Artificial Aplicada a Ambientes Corporativos pela SiDi/Softex e desenvolvedor de sistemas e aplicações web. Estudo como funciona, na prática, o atendimento de pedidos de certidão no Registro Civil quando o pedido envolve dados pessoais: quem pode pedir, o que exigir do requerente e quando a expedição depende de autorização judicial.</w:t>
       </w:r>
     </w:p>
     <w:p>
@@ -161,7 +217,7 @@
     </w:p>
     <w:p>
       <w:pPr>
-        <w:spacing w:after="600"/>
+        <w:spacing w:after="480"/>
       </w:pPr>
       <w:r>
         <w:t>Atenciosamente,</w:t>
@@ -177,30 +233,49 @@
     </w:p>
     <w:p>
       <w:pPr>
-        <w:spacing w:after="40"/>
+        <w:spacing w:after="20"/>
       </w:pPr>
       <w:r>
         <w:rPr>
           <w:b/>
           <w:bCs/>
+          <w:sz w:val="23"/>
+          <w:szCs w:val="23"/>
         </w:rPr>
         <w:t>Idarlan Magalhães</w:t>
       </w:r>
     </w:p>
     <w:p>
-      <w:pPr>
-        <w:spacing w:after="40"/>
-      </w:pPr>
       <w:r>
-        <w:t>Residência em Inteligência Artificial — SiDi/Softex</w:t>
+        <w:rPr>
+          <w:color w:val="1F4E79"/>
+          <w:sz w:val="18"/>
+          <w:szCs w:val="18"/>
+        </w:rPr>
+        <w:t>Residente em Inteligência Artificial Aplicada a Ambientes Corporativos · SiDi/Softex</w:t>
+      </w:r>
+    </w:p>
+    <w:p>
+      <w:r>
+        <w:rPr>
+          <w:color w:val="1F4E79"/>
+          <w:sz w:val="18"/>
+          <w:szCs w:val="18"/>
+        </w:rPr>
+        <w:t>Desenvolvedor de sistemas e aplicações web</w:t>
       </w:r>
     </w:p>
     <w:p>
       <w:pPr>
-        <w:spacing w:after="40"/>
+        <w:spacing w:before="40" w:after="120"/>
       </w:pPr>
       <w:r>
-        <w:t>E-mail: idarlandias@gmail.com      Telefone/WhatsApp: ______________________</w:t>
+        <w:rPr>
+          <w:color w:val="595959"/>
+          <w:sz w:val="17"/>
+          <w:szCs w:val="17"/>
+        </w:rPr>
+        <w:t>idarlandias@gmail.com   ·   github.com/idarlandias   ·   linkedin.com/in/idarlandias   ·   WhatsApp: ____________________</w:t>
       </w:r>
     </w:p>
     <w:p>
@@ -424,7 +499,7 @@
           <w:left w:w="10" w:type="dxa"/>
           <w:right w:w="10" w:type="dxa"/>
         </w:tblCellMar>
-        <w:tblLook w:val="04A0" w:firstRow="1" w:lastRow="0" w:firstColumn="1" w:lastColumn="0" w:noHBand="0" w:noVBand="1"/>
+        <w:tblLook w:val="0000" w:firstRow="0" w:lastRow="0" w:firstColumn="0" w:lastColumn="0" w:noHBand="0" w:noVBand="0"/>
       </w:tblPr>
       <w:tblGrid>
         <w:gridCol w:w="2600"/>
@@ -920,7 +995,7 @@
           <w:left w:w="10" w:type="dxa"/>
           <w:right w:w="10" w:type="dxa"/>
         </w:tblCellMar>
-        <w:tblLook w:val="04A0" w:firstRow="1" w:lastRow="0" w:firstColumn="1" w:lastColumn="0" w:noHBand="0" w:noVBand="1"/>
+        <w:tblLook w:val="0000" w:firstRow="0" w:lastRow="0" w:firstColumn="0" w:lastColumn="0" w:noHBand="0" w:noVBand="0"/>
       </w:tblPr>
       <w:tblGrid>
         <w:gridCol w:w="2600"/>
@@ -1416,7 +1491,7 @@
           <w:left w:w="10" w:type="dxa"/>
           <w:right w:w="10" w:type="dxa"/>
         </w:tblCellMar>
-        <w:tblLook w:val="04A0" w:firstRow="1" w:lastRow="0" w:firstColumn="1" w:lastColumn="0" w:noHBand="0" w:noVBand="1"/>
+        <w:tblLook w:val="0000" w:firstRow="0" w:lastRow="0" w:firstColumn="0" w:lastColumn="0" w:noHBand="0" w:noVBand="0"/>
       </w:tblPr>
       <w:tblGrid>
         <w:gridCol w:w="2600"/>
@@ -1912,7 +1987,7 @@
           <w:left w:w="10" w:type="dxa"/>
           <w:right w:w="10" w:type="dxa"/>
         </w:tblCellMar>
-        <w:tblLook w:val="04A0" w:firstRow="1" w:lastRow="0" w:firstColumn="1" w:lastColumn="0" w:noHBand="0" w:noVBand="1"/>
+        <w:tblLook w:val="0000" w:firstRow="0" w:lastRow="0" w:firstColumn="0" w:lastColumn="0" w:noHBand="0" w:noVBand="0"/>
       </w:tblPr>
       <w:tblGrid>
         <w:gridCol w:w="2600"/>
@@ -2408,7 +2483,7 @@
           <w:left w:w="10" w:type="dxa"/>
           <w:right w:w="10" w:type="dxa"/>
         </w:tblCellMar>
-        <w:tblLook w:val="04A0" w:firstRow="1" w:lastRow="0" w:firstColumn="1" w:lastColumn="0" w:noHBand="0" w:noVBand="1"/>
+        <w:tblLook w:val="0000" w:firstRow="0" w:lastRow="0" w:firstColumn="0" w:lastColumn="0" w:noHBand="0" w:noVBand="0"/>
       </w:tblPr>
       <w:tblGrid>
         <w:gridCol w:w="2600"/>
@@ -2904,7 +2979,7 @@
           <w:left w:w="10" w:type="dxa"/>
           <w:right w:w="10" w:type="dxa"/>
         </w:tblCellMar>
-        <w:tblLook w:val="04A0" w:firstRow="1" w:lastRow="0" w:firstColumn="1" w:lastColumn="0" w:noHBand="0" w:noVBand="1"/>
+        <w:tblLook w:val="0000" w:firstRow="0" w:lastRow="0" w:firstColumn="0" w:lastColumn="0" w:noHBand="0" w:noVBand="0"/>
       </w:tblPr>
       <w:tblGrid>
         <w:gridCol w:w="2600"/>
@@ -3400,7 +3475,7 @@
           <w:left w:w="10" w:type="dxa"/>
           <w:right w:w="10" w:type="dxa"/>
         </w:tblCellMar>
-        <w:tblLook w:val="04A0" w:firstRow="1" w:lastRow="0" w:firstColumn="1" w:lastColumn="0" w:noHBand="0" w:noVBand="1"/>
+        <w:tblLook w:val="0000" w:firstRow="0" w:lastRow="0" w:firstColumn="0" w:lastColumn="0" w:noHBand="0" w:noVBand="0"/>
       </w:tblPr>
       <w:tblGrid>
         <w:gridCol w:w="2600"/>
@@ -3896,7 +3971,7 @@
           <w:left w:w="10" w:type="dxa"/>
           <w:right w:w="10" w:type="dxa"/>
         </w:tblCellMar>
-        <w:tblLook w:val="04A0" w:firstRow="1" w:lastRow="0" w:firstColumn="1" w:lastColumn="0" w:noHBand="0" w:noVBand="1"/>
+        <w:tblLook w:val="0000" w:firstRow="0" w:lastRow="0" w:firstColumn="0" w:lastColumn="0" w:noHBand="0" w:noVBand="0"/>
       </w:tblPr>
       <w:tblGrid>
         <w:gridCol w:w="2600"/>
@@ -4392,7 +4467,7 @@
           <w:left w:w="10" w:type="dxa"/>
           <w:right w:w="10" w:type="dxa"/>
         </w:tblCellMar>
-        <w:tblLook w:val="04A0" w:firstRow="1" w:lastRow="0" w:firstColumn="1" w:lastColumn="0" w:noHBand="0" w:noVBand="1"/>
+        <w:tblLook w:val="0000" w:firstRow="0" w:lastRow="0" w:firstColumn="0" w:lastColumn="0" w:noHBand="0" w:noVBand="0"/>
       </w:tblPr>
       <w:tblGrid>
         <w:gridCol w:w="2600"/>
@@ -4888,7 +4963,7 @@
           <w:left w:w="10" w:type="dxa"/>
           <w:right w:w="10" w:type="dxa"/>
         </w:tblCellMar>
-        <w:tblLook w:val="04A0" w:firstRow="1" w:lastRow="0" w:firstColumn="1" w:lastColumn="0" w:noHBand="0" w:noVBand="1"/>
+        <w:tblLook w:val="0000" w:firstRow="0" w:lastRow="0" w:firstColumn="0" w:lastColumn="0" w:noHBand="0" w:noVBand="0"/>
       </w:tblPr>
       <w:tblGrid>
         <w:gridCol w:w="2600"/>
@@ -5384,7 +5459,7 @@
           <w:left w:w="10" w:type="dxa"/>
           <w:right w:w="10" w:type="dxa"/>
         </w:tblCellMar>
-        <w:tblLook w:val="04A0" w:firstRow="1" w:lastRow="0" w:firstColumn="1" w:lastColumn="0" w:noHBand="0" w:noVBand="1"/>
+        <w:tblLook w:val="0000" w:firstRow="0" w:lastRow="0" w:firstColumn="0" w:lastColumn="0" w:noHBand="0" w:noVBand="0"/>
       </w:tblPr>
       <w:tblGrid>
         <w:gridCol w:w="2600"/>
@@ -5880,7 +5955,7 @@
           <w:left w:w="10" w:type="dxa"/>
           <w:right w:w="10" w:type="dxa"/>
         </w:tblCellMar>
-        <w:tblLook w:val="04A0" w:firstRow="1" w:lastRow="0" w:firstColumn="1" w:lastColumn="0" w:noHBand="0" w:noVBand="1"/>
+        <w:tblLook w:val="0000" w:firstRow="0" w:lastRow="0" w:firstColumn="0" w:lastColumn="0" w:noHBand="0" w:noVBand="0"/>
       </w:tblPr>
       <w:tblGrid>
         <w:gridCol w:w="2600"/>
@@ -6376,7 +6451,7 @@
           <w:left w:w="10" w:type="dxa"/>
           <w:right w:w="10" w:type="dxa"/>
         </w:tblCellMar>
-        <w:tblLook w:val="04A0" w:firstRow="1" w:lastRow="0" w:firstColumn="1" w:lastColumn="0" w:noHBand="0" w:noVBand="1"/>
+        <w:tblLook w:val="0000" w:firstRow="0" w:lastRow="0" w:firstColumn="0" w:lastColumn="0" w:noHBand="0" w:noVBand="0"/>
       </w:tblPr>
       <w:tblGrid>
         <w:gridCol w:w="2600"/>
@@ -6859,7 +6934,7 @@
           <w:left w:w="10" w:type="dxa"/>
           <w:right w:w="10" w:type="dxa"/>
         </w:tblCellMar>
-        <w:tblLook w:val="04A0" w:firstRow="1" w:lastRow="0" w:firstColumn="1" w:lastColumn="0" w:noHBand="0" w:noVBand="1"/>
+        <w:tblLook w:val="0000" w:firstRow="0" w:lastRow="0" w:firstColumn="0" w:lastColumn="0" w:noHBand="0" w:noVBand="0"/>
       </w:tblPr>
       <w:tblGrid>
         <w:gridCol w:w="2600"/>
@@ -7333,7 +7408,7 @@
           <w:left w:w="10" w:type="dxa"/>
           <w:right w:w="10" w:type="dxa"/>
         </w:tblCellMar>
-        <w:tblLook w:val="04A0" w:firstRow="1" w:lastRow="0" w:firstColumn="1" w:lastColumn="0" w:noHBand="0" w:noVBand="1"/>
+        <w:tblLook w:val="0000" w:firstRow="0" w:lastRow="0" w:firstColumn="0" w:lastColumn="0" w:noHBand="0" w:noVBand="0"/>
       </w:tblPr>
       <w:tblGrid>
         <w:gridCol w:w="896"/>
@@ -10745,7 +10820,7 @@
           <w:left w:w="10" w:type="dxa"/>
           <w:right w:w="10" w:type="dxa"/>
         </w:tblCellMar>
-        <w:tblLook w:val="04A0" w:firstRow="1" w:lastRow="0" w:firstColumn="1" w:lastColumn="0" w:noHBand="0" w:noVBand="1"/>
+        <w:tblLook w:val="0000" w:firstRow="0" w:lastRow="0" w:firstColumn="0" w:lastColumn="0" w:noHBand="0" w:noVBand="0"/>
       </w:tblPr>
       <w:tblGrid>
         <w:gridCol w:w="2600"/>
@@ -11171,7 +11246,7 @@
         <w:sz w:val="16"/>
         <w:szCs w:val="16"/>
       </w:rPr>
-      <w:t xml:space="preserve">Pesquisa — atendimento de pedidos de certidão do Registro Civil · página </w:t>
+      <w:t xml:space="preserve">Idarlan Magalhães · Pesquisa — atendimento de pedidos de certidão do Registro Civil · página </w:t>
     </w:r>
     <w:r>
       <w:rPr>
@@ -11240,10 +11315,10 @@
 <file path=word/numbering.xml><?xml version="1.0" encoding="utf-8"?>
 <w:numbering xmlns:wpc="http://schemas.microsoft.com/office/word/2010/wordprocessingCanvas" xmlns:cx="http://schemas.microsoft.com/office/drawing/2014/chartex" xmlns:cx1="http://schemas.microsoft.com/office/drawing/2015/9/8/chartex" xmlns:cx2="http://schemas.microsoft.com/office/drawing/2015/10/21/chartex" xmlns:cx3="http://schemas.microsoft.com/office/drawing/2016/5/9/chartex" xmlns:cx4="http://schemas.microsoft.com/office/drawing/2016/5/10/chartex" xmlns:cx5="http://schemas.microsoft.com/office/drawing/2016/5/11/chartex" xmlns:cx6="http://schemas.microsoft.com/office/drawing/2016/5/12/chartex" xmlns:cx7="http://schemas.microsoft.com/office/drawing/2016/5/13/chartex" xmlns:cx8="http://schemas.microsoft.com/office/drawing/2016/5/14/chartex" xmlns:mc="http://schemas.openxmlformats.org/markup-compatibility/2006" xmlns:aink="http://schemas.microsoft.com/office/drawing/2016/ink" xmlns:am3d="http://schemas.microsoft.com/office/drawing/2017/model3d" xmlns:o="urn:schemas-microsoft-com:office:office" xmlns:oel="http://schemas.microsoft.com/office/2019/extlst" xmlns:r="http://schemas.openxmlformats.org/officeDocument/2006/relationships" xmlns:m="http://schemas.openxmlformats.org/officeDocument/2006/math" xmlns:v="urn:schemas-microsoft-com:vml" xmlns:wp14="http://schemas.microsoft.com/office/word/2010/wordprocessingDrawing" xmlns:wp="http://schemas.openxmlformats.org/drawingml/2006/wordprocessingDrawing" xmlns:w10="urn:schemas-microsoft-com:office:word" xmlns:w="http://schemas.openxmlformats.org/wordprocessingml/2006/main" xmlns:w14="http://schemas.microsoft.com/office/word/2010/wordml" xmlns:w15="http://schemas.microsoft.com/office/word/2012/wordml" xmlns:w16cex="http://schemas.microsoft.com/office/word/2018/wordml/cex" xmlns:w16cid="http://schemas.microsoft.com/office/word/2016/wordml/cid" xmlns:w16="http://schemas.microsoft.com/office/word/2018/wordml" xmlns:w16du="http://schemas.microsoft.com/office/word/2023/wordml/word16du" xmlns:w16sdtdh="http://schemas.microsoft.com/office/word/2020/wordml/sdtdatahash" xmlns:w16sdtfl="http://schemas.microsoft.com/office/word/2024/wordml/sdtformatlock" xmlns:w16se="http://schemas.microsoft.com/office/word/2015/wordml/symex" xmlns:wpg="http://schemas.microsoft.com/office/word/2010/wordprocessingGroup" xmlns:wpi="http://schemas.microsoft.com/office/word/2010/wordprocessingInk" xmlns:wne="http://schemas.microsoft.com/office/word/2006/wordml" xmlns:wps="http://schemas.microsoft.com/office/word/2010/wordprocessingShape" mc:Ignorable="w14 w15 w16se w16cid w16 w16cex w16sdtdh w16sdtfl w16du wp14">
   <w:abstractNum w:abstractNumId="0" w15:restartNumberingAfterBreak="0">
-    <w:nsid w:val="36145993"/>
+    <w:nsid w:val="00C82BFE"/>
     <w:multiLevelType w:val="hybridMultilevel"/>
-    <w:tmpl w:val="EFBEF058"/>
-    <w:lvl w:ilvl="0" w:tplc="E0DC1B16">
+    <w:tmpl w:val="2BF26B88"/>
+    <w:lvl w:ilvl="0" w:tplc="B532C138">
       <w:start w:val="1"/>
       <w:numFmt w:val="bullet"/>
       <w:lvlText w:val="●"/>
@@ -11252,7 +11327,7 @@
         <w:ind w:left="720" w:hanging="360"/>
       </w:pPr>
     </w:lvl>
-    <w:lvl w:ilvl="1" w:tplc="6340081C">
+    <w:lvl w:ilvl="1" w:tplc="FBEE7E78">
       <w:start w:val="1"/>
       <w:numFmt w:val="bullet"/>
       <w:lvlText w:val="○"/>
@@ -11261,7 +11336,7 @@
         <w:ind w:left="1440" w:hanging="360"/>
       </w:pPr>
     </w:lvl>
-    <w:lvl w:ilvl="2" w:tplc="8040B500">
+    <w:lvl w:ilvl="2" w:tplc="514C361E">
       <w:start w:val="1"/>
       <w:numFmt w:val="bullet"/>
       <w:lvlText w:val="■"/>
@@ -11270,7 +11345,7 @@
         <w:ind w:left="2160" w:hanging="360"/>
       </w:pPr>
     </w:lvl>
-    <w:lvl w:ilvl="3" w:tplc="65E09C3A">
+    <w:lvl w:ilvl="3" w:tplc="94AC1A6A">
       <w:start w:val="1"/>
       <w:numFmt w:val="bullet"/>
       <w:lvlText w:val="●"/>
@@ -11279,7 +11354,7 @@
         <w:ind w:left="2880" w:hanging="360"/>
       </w:pPr>
     </w:lvl>
-    <w:lvl w:ilvl="4" w:tplc="ED00B3CA">
+    <w:lvl w:ilvl="4" w:tplc="A768F14E">
       <w:start w:val="1"/>
       <w:numFmt w:val="bullet"/>
       <w:lvlText w:val="○"/>
@@ -11288,7 +11363,7 @@
         <w:ind w:left="3600" w:hanging="360"/>
       </w:pPr>
     </w:lvl>
-    <w:lvl w:ilvl="5" w:tplc="C3F88E78">
+    <w:lvl w:ilvl="5" w:tplc="C7104794">
       <w:start w:val="1"/>
       <w:numFmt w:val="bullet"/>
       <w:lvlText w:val="■"/>
@@ -11297,7 +11372,7 @@
         <w:ind w:left="4320" w:hanging="360"/>
       </w:pPr>
     </w:lvl>
-    <w:lvl w:ilvl="6" w:tplc="096E03C2">
+    <w:lvl w:ilvl="6" w:tplc="4C62B812">
       <w:start w:val="1"/>
       <w:numFmt w:val="bullet"/>
       <w:lvlText w:val="●"/>
@@ -11306,7 +11381,7 @@
         <w:ind w:left="5040" w:hanging="360"/>
       </w:pPr>
     </w:lvl>
-    <w:lvl w:ilvl="7" w:tplc="639E0CB8">
+    <w:lvl w:ilvl="7" w:tplc="43660D64">
       <w:start w:val="1"/>
       <w:numFmt w:val="bullet"/>
       <w:lvlText w:val="●"/>
@@ -11315,7 +11390,7 @@
         <w:ind w:left="5760" w:hanging="360"/>
       </w:pPr>
     </w:lvl>
-    <w:lvl w:ilvl="8" w:tplc="2FF643C6">
+    <w:lvl w:ilvl="8" w:tplc="FF80710A">
       <w:start w:val="1"/>
       <w:numFmt w:val="bullet"/>
       <w:lvlText w:val="●"/>
@@ -11325,7 +11400,7 @@
       </w:pPr>
     </w:lvl>
   </w:abstractNum>
-  <w:num w:numId="1" w16cid:durableId="728112310">
+  <w:num w:numId="1" w16cid:durableId="4792823">
     <w:abstractNumId w:val="0"/>
     <w:lvlOverride w:ilvl="0">
       <w:startOverride w:val="1"/>

</xml_diff>